<commit_message>
Adding the git hub link in to the pdf
</commit_message>
<xml_diff>
--- a/docs/IT23543164_Lab5.docx
+++ b/docs/IT23543164_Lab5.docx
@@ -2415,31 +2415,35 @@
       </w:sdtContent>
     </w:sdt>
     <w:p>
-      <w:pPr>
-        <w:rPr>
-          <w:rFonts w:ascii="Times New Roman" w:hAnsi="Times New Roman" w:cs="Times New Roman"/>
-          <w:sz w:val="36"/>
-          <w:szCs w:val="36"/>
-        </w:rPr>
-      </w:pPr>
-    </w:p>
-    <w:p>
-      <w:pPr>
-        <w:rPr>
-          <w:rFonts w:ascii="Times New Roman" w:hAnsi="Times New Roman" w:cs="Times New Roman"/>
-          <w:sz w:val="36"/>
-          <w:szCs w:val="36"/>
-        </w:rPr>
-      </w:pPr>
-    </w:p>
-    <w:p>
-      <w:pPr>
-        <w:rPr>
-          <w:rFonts w:ascii="Times New Roman" w:hAnsi="Times New Roman" w:cs="Times New Roman"/>
-          <w:sz w:val="36"/>
-          <w:szCs w:val="36"/>
-        </w:rPr>
-      </w:pPr>
+      <w:r>
+        <w:rPr>
+          <w:rFonts w:ascii="Times New Roman" w:hAnsi="Times New Roman" w:cs="Times New Roman"/>
+        </w:rPr>
+        <w:t xml:space="preserve">Git Hub </w:t>
+      </w:r>
+      <w:proofErr w:type="gramStart"/>
+      <w:r>
+        <w:rPr>
+          <w:rFonts w:ascii="Times New Roman" w:hAnsi="Times New Roman" w:cs="Times New Roman"/>
+        </w:rPr>
+        <w:t>Link</w:t>
+      </w:r>
+      <w:r>
+        <w:t xml:space="preserve"> :</w:t>
+      </w:r>
+      <w:proofErr w:type="gramEnd"/>
+      <w:r>
+        <w:t xml:space="preserve"> </w:t>
+      </w:r>
+      <w:hyperlink r:id="rId9" w:history="1">
+        <w:r>
+          <w:rPr>
+            <w:rStyle w:val="Hyperlink"/>
+            <w:rFonts w:ascii="Times New Roman" w:hAnsi="Times New Roman" w:cs="Times New Roman"/>
+          </w:rPr>
+          <w:t>https://github.com/Chandulajeewantha2003/fitflow-redesign.git</w:t>
+        </w:r>
+      </w:hyperlink>
     </w:p>
     <w:p>
       <w:pPr>
@@ -7027,19 +7031,7 @@
         <w:rPr>
           <w:rFonts w:ascii="Times New Roman" w:hAnsi="Times New Roman" w:cs="Times New Roman"/>
         </w:rPr>
-        <w:t>2.</w:t>
-      </w:r>
-      <w:r>
-        <w:rPr>
-          <w:rFonts w:ascii="Times New Roman" w:hAnsi="Times New Roman" w:cs="Times New Roman"/>
-        </w:rPr>
-        <w:t>5</w:t>
-      </w:r>
-      <w:r>
-        <w:rPr>
-          <w:rFonts w:ascii="Times New Roman" w:hAnsi="Times New Roman" w:cs="Times New Roman"/>
-        </w:rPr>
-        <w:t xml:space="preserve"> Combined technology choice</w:t>
+        <w:t>2.5 Combined technology choice</w:t>
       </w:r>
       <w:bookmarkEnd w:id="9"/>
     </w:p>
@@ -9693,7 +9685,7 @@
                     <pic:cNvPicPr/>
                   </pic:nvPicPr>
                   <pic:blipFill>
-                    <a:blip r:embed="rId9">
+                    <a:blip r:embed="rId10">
                       <a:extLst>
                         <a:ext uri="{28A0092B-C50C-407E-A947-70E740481C1C}">
                           <a14:useLocalDpi xmlns:a14="http://schemas.microsoft.com/office/drawing/2010/main" val="0"/>
@@ -10773,9 +10765,9 @@
         <w:tblLook w:val="04A0" w:firstRow="1" w:lastRow="0" w:firstColumn="1" w:lastColumn="0" w:noHBand="0" w:noVBand="1"/>
       </w:tblPr>
       <w:tblGrid>
-        <w:gridCol w:w="3106"/>
-        <w:gridCol w:w="3128"/>
-        <w:gridCol w:w="3116"/>
+        <w:gridCol w:w="3102"/>
+        <w:gridCol w:w="3133"/>
+        <w:gridCol w:w="3115"/>
       </w:tblGrid>
       <w:tr>
         <w:trPr>
@@ -10791,6 +10783,8 @@
             <w:pPr>
               <w:rPr>
                 <w:rFonts w:ascii="Times New Roman" w:hAnsi="Times New Roman" w:cs="Times New Roman"/>
+                <w:sz w:val="20"/>
+                <w:szCs w:val="36"/>
               </w:rPr>
             </w:pPr>
             <w:r>
@@ -10798,7 +10792,8 @@
                 <w:rFonts w:ascii="Times New Roman" w:hAnsi="Times New Roman" w:cs="Times New Roman"/>
                 <w:b/>
                 <w:color w:val="FFFFFF"/>
-                <w:sz w:val="14"/>
+                <w:sz w:val="20"/>
+                <w:szCs w:val="36"/>
               </w:rPr>
               <w:t>Concern</w:t>
             </w:r>
@@ -10813,6 +10808,8 @@
             <w:pPr>
               <w:rPr>
                 <w:rFonts w:ascii="Times New Roman" w:hAnsi="Times New Roman" w:cs="Times New Roman"/>
+                <w:sz w:val="20"/>
+                <w:szCs w:val="36"/>
               </w:rPr>
             </w:pPr>
             <w:r>
@@ -10820,7 +10817,8 @@
                 <w:rFonts w:ascii="Times New Roman" w:hAnsi="Times New Roman" w:cs="Times New Roman"/>
                 <w:b/>
                 <w:color w:val="FFFFFF"/>
-                <w:sz w:val="14"/>
+                <w:sz w:val="20"/>
+                <w:szCs w:val="36"/>
               </w:rPr>
               <w:t>Design control</w:t>
             </w:r>
@@ -10835,6 +10833,8 @@
             <w:pPr>
               <w:rPr>
                 <w:rFonts w:ascii="Times New Roman" w:hAnsi="Times New Roman" w:cs="Times New Roman"/>
+                <w:sz w:val="20"/>
+                <w:szCs w:val="36"/>
               </w:rPr>
             </w:pPr>
             <w:r>
@@ -10842,7 +10842,8 @@
                 <w:rFonts w:ascii="Times New Roman" w:hAnsi="Times New Roman" w:cs="Times New Roman"/>
                 <w:b/>
                 <w:color w:val="FFFFFF"/>
-                <w:sz w:val="14"/>
+                <w:sz w:val="20"/>
+                <w:szCs w:val="36"/>
               </w:rPr>
               <w:t>Verification before production</w:t>
             </w:r>
@@ -10862,12 +10863,15 @@
               <w:spacing w:after="20"/>
               <w:rPr>
                 <w:rFonts w:ascii="Times New Roman" w:hAnsi="Times New Roman" w:cs="Times New Roman"/>
-              </w:rPr>
-            </w:pPr>
-            <w:r>
-              <w:rPr>
-                <w:rFonts w:ascii="Times New Roman" w:hAnsi="Times New Roman" w:cs="Times New Roman"/>
-                <w:sz w:val="14"/>
+                <w:sz w:val="18"/>
+                <w:szCs w:val="32"/>
+              </w:rPr>
+            </w:pPr>
+            <w:r>
+              <w:rPr>
+                <w:rFonts w:ascii="Times New Roman" w:hAnsi="Times New Roman" w:cs="Times New Roman"/>
+                <w:sz w:val="18"/>
+                <w:szCs w:val="32"/>
               </w:rPr>
               <w:t>Availability / scalability</w:t>
             </w:r>
@@ -10882,12 +10886,15 @@
               <w:spacing w:after="20"/>
               <w:rPr>
                 <w:rFonts w:ascii="Times New Roman" w:hAnsi="Times New Roman" w:cs="Times New Roman"/>
-              </w:rPr>
-            </w:pPr>
-            <w:r>
-              <w:rPr>
-                <w:rFonts w:ascii="Times New Roman" w:hAnsi="Times New Roman" w:cs="Times New Roman"/>
-                <w:sz w:val="14"/>
+                <w:sz w:val="18"/>
+                <w:szCs w:val="32"/>
+              </w:rPr>
+            </w:pPr>
+            <w:r>
+              <w:rPr>
+                <w:rFonts w:ascii="Times New Roman" w:hAnsi="Times New Roman" w:cs="Times New Roman"/>
+                <w:sz w:val="18"/>
+                <w:szCs w:val="32"/>
               </w:rPr>
               <w:t>Stateless API, managed DB, cache limits, backpressure, job timeout.</w:t>
             </w:r>
@@ -10902,12 +10909,15 @@
               <w:spacing w:after="20"/>
               <w:rPr>
                 <w:rFonts w:ascii="Times New Roman" w:hAnsi="Times New Roman" w:cs="Times New Roman"/>
-              </w:rPr>
-            </w:pPr>
-            <w:r>
-              <w:rPr>
-                <w:rFonts w:ascii="Times New Roman" w:hAnsi="Times New Roman" w:cs="Times New Roman"/>
-                <w:sz w:val="14"/>
+                <w:sz w:val="18"/>
+                <w:szCs w:val="32"/>
+              </w:rPr>
+            </w:pPr>
+            <w:r>
+              <w:rPr>
+                <w:rFonts w:ascii="Times New Roman" w:hAnsi="Times New Roman" w:cs="Times New Roman"/>
+                <w:sz w:val="18"/>
+                <w:szCs w:val="32"/>
               </w:rPr>
               <w:t>Load tests, failover, restore drill.</w:t>
             </w:r>
@@ -10928,12 +10938,15 @@
               <w:spacing w:after="20"/>
               <w:rPr>
                 <w:rFonts w:ascii="Times New Roman" w:hAnsi="Times New Roman" w:cs="Times New Roman"/>
-              </w:rPr>
-            </w:pPr>
-            <w:r>
-              <w:rPr>
-                <w:rFonts w:ascii="Times New Roman" w:hAnsi="Times New Roman" w:cs="Times New Roman"/>
-                <w:sz w:val="14"/>
+                <w:sz w:val="18"/>
+                <w:szCs w:val="32"/>
+              </w:rPr>
+            </w:pPr>
+            <w:r>
+              <w:rPr>
+                <w:rFonts w:ascii="Times New Roman" w:hAnsi="Times New Roman" w:cs="Times New Roman"/>
+                <w:sz w:val="18"/>
+                <w:szCs w:val="32"/>
               </w:rPr>
               <w:t>Privacy</w:t>
             </w:r>
@@ -10949,12 +10962,15 @@
               <w:spacing w:after="20"/>
               <w:rPr>
                 <w:rFonts w:ascii="Times New Roman" w:hAnsi="Times New Roman" w:cs="Times New Roman"/>
-              </w:rPr>
-            </w:pPr>
-            <w:r>
-              <w:rPr>
-                <w:rFonts w:ascii="Times New Roman" w:hAnsi="Times New Roman" w:cs="Times New Roman"/>
-                <w:sz w:val="14"/>
+                <w:sz w:val="18"/>
+                <w:szCs w:val="32"/>
+              </w:rPr>
+            </w:pPr>
+            <w:r>
+              <w:rPr>
+                <w:rFonts w:ascii="Times New Roman" w:hAnsi="Times New Roman" w:cs="Times New Roman"/>
+                <w:sz w:val="18"/>
+                <w:szCs w:val="32"/>
               </w:rPr>
               <w:t>Encryption, minimum data, per-user authorization, opt-in sharing, audit.</w:t>
             </w:r>
@@ -10970,12 +10986,15 @@
               <w:spacing w:after="20"/>
               <w:rPr>
                 <w:rFonts w:ascii="Times New Roman" w:hAnsi="Times New Roman" w:cs="Times New Roman"/>
-              </w:rPr>
-            </w:pPr>
-            <w:r>
-              <w:rPr>
-                <w:rFonts w:ascii="Times New Roman" w:hAnsi="Times New Roman" w:cs="Times New Roman"/>
-                <w:sz w:val="14"/>
+                <w:sz w:val="18"/>
+                <w:szCs w:val="32"/>
+              </w:rPr>
+            </w:pPr>
+            <w:r>
+              <w:rPr>
+                <w:rFonts w:ascii="Times New Roman" w:hAnsi="Times New Roman" w:cs="Times New Roman"/>
+                <w:sz w:val="18"/>
+                <w:szCs w:val="32"/>
               </w:rPr>
               <w:t>Threat model, privacy assessment, role tests.</w:t>
             </w:r>
@@ -10995,12 +11014,15 @@
               <w:spacing w:after="20"/>
               <w:rPr>
                 <w:rFonts w:ascii="Times New Roman" w:hAnsi="Times New Roman" w:cs="Times New Roman"/>
-              </w:rPr>
-            </w:pPr>
-            <w:r>
-              <w:rPr>
-                <w:rFonts w:ascii="Times New Roman" w:hAnsi="Times New Roman" w:cs="Times New Roman"/>
-                <w:sz w:val="14"/>
+                <w:sz w:val="18"/>
+                <w:szCs w:val="32"/>
+              </w:rPr>
+            </w:pPr>
+            <w:r>
+              <w:rPr>
+                <w:rFonts w:ascii="Times New Roman" w:hAnsi="Times New Roman" w:cs="Times New Roman"/>
+                <w:sz w:val="18"/>
+                <w:szCs w:val="32"/>
               </w:rPr>
               <w:t>AI safety</w:t>
             </w:r>
@@ -11015,12 +11037,15 @@
               <w:spacing w:after="20"/>
               <w:rPr>
                 <w:rFonts w:ascii="Times New Roman" w:hAnsi="Times New Roman" w:cs="Times New Roman"/>
-              </w:rPr>
-            </w:pPr>
-            <w:r>
-              <w:rPr>
-                <w:rFonts w:ascii="Times New Roman" w:hAnsi="Times New Roman" w:cs="Times New Roman"/>
-                <w:sz w:val="14"/>
+                <w:sz w:val="18"/>
+                <w:szCs w:val="32"/>
+              </w:rPr>
+            </w:pPr>
+            <w:r>
+              <w:rPr>
+                <w:rFonts w:ascii="Times New Roman" w:hAnsi="Times New Roman" w:cs="Times New Roman"/>
+                <w:sz w:val="18"/>
+                <w:szCs w:val="32"/>
               </w:rPr>
               <w:t>Human-editable results, exercise constraints, fallbacks, model monitoring.</w:t>
             </w:r>
@@ -11035,12 +11060,15 @@
               <w:spacing w:after="20"/>
               <w:rPr>
                 <w:rFonts w:ascii="Times New Roman" w:hAnsi="Times New Roman" w:cs="Times New Roman"/>
-              </w:rPr>
-            </w:pPr>
-            <w:r>
-              <w:rPr>
-                <w:rFonts w:ascii="Times New Roman" w:hAnsi="Times New Roman" w:cs="Times New Roman"/>
-                <w:sz w:val="14"/>
+                <w:sz w:val="18"/>
+                <w:szCs w:val="32"/>
+              </w:rPr>
+            </w:pPr>
+            <w:r>
+              <w:rPr>
+                <w:rFonts w:ascii="Times New Roman" w:hAnsi="Times New Roman" w:cs="Times New Roman"/>
+                <w:sz w:val="18"/>
+                <w:szCs w:val="32"/>
               </w:rPr>
               <w:t>Trainer review, bias tests, model performance on device.</w:t>
             </w:r>
@@ -11061,12 +11089,15 @@
               <w:spacing w:after="20"/>
               <w:rPr>
                 <w:rFonts w:ascii="Times New Roman" w:hAnsi="Times New Roman" w:cs="Times New Roman"/>
-              </w:rPr>
-            </w:pPr>
-            <w:r>
-              <w:rPr>
-                <w:rFonts w:ascii="Times New Roman" w:hAnsi="Times New Roman" w:cs="Times New Roman"/>
-                <w:sz w:val="14"/>
+                <w:sz w:val="18"/>
+                <w:szCs w:val="32"/>
+              </w:rPr>
+            </w:pPr>
+            <w:r>
+              <w:rPr>
+                <w:rFonts w:ascii="Times New Roman" w:hAnsi="Times New Roman" w:cs="Times New Roman"/>
+                <w:sz w:val="18"/>
+                <w:szCs w:val="32"/>
               </w:rPr>
               <w:t>Accessibility</w:t>
             </w:r>
@@ -11082,12 +11113,15 @@
               <w:spacing w:after="20"/>
               <w:rPr>
                 <w:rFonts w:ascii="Times New Roman" w:hAnsi="Times New Roman" w:cs="Times New Roman"/>
-              </w:rPr>
-            </w:pPr>
-            <w:r>
-              <w:rPr>
-                <w:rFonts w:ascii="Times New Roman" w:hAnsi="Times New Roman" w:cs="Times New Roman"/>
-                <w:sz w:val="14"/>
+                <w:sz w:val="18"/>
+                <w:szCs w:val="32"/>
+              </w:rPr>
+            </w:pPr>
+            <w:r>
+              <w:rPr>
+                <w:rFonts w:ascii="Times New Roman" w:hAnsi="Times New Roman" w:cs="Times New Roman"/>
+                <w:sz w:val="18"/>
+                <w:szCs w:val="32"/>
               </w:rPr>
               <w:t>Readable text, keyboard/screen-reader navigation, reduced motion.</w:t>
             </w:r>
@@ -11103,12 +11137,15 @@
               <w:spacing w:after="20"/>
               <w:rPr>
                 <w:rFonts w:ascii="Times New Roman" w:hAnsi="Times New Roman" w:cs="Times New Roman"/>
-              </w:rPr>
-            </w:pPr>
-            <w:r>
-              <w:rPr>
-                <w:rFonts w:ascii="Times New Roman" w:hAnsi="Times New Roman" w:cs="Times New Roman"/>
-                <w:sz w:val="14"/>
+                <w:sz w:val="18"/>
+                <w:szCs w:val="32"/>
+              </w:rPr>
+            </w:pPr>
+            <w:r>
+              <w:rPr>
+                <w:rFonts w:ascii="Times New Roman" w:hAnsi="Times New Roman" w:cs="Times New Roman"/>
+                <w:sz w:val="18"/>
+                <w:szCs w:val="32"/>
               </w:rPr>
               <w:t>Representative users and accessibility testing.</w:t>
             </w:r>
@@ -11128,12 +11165,15 @@
               <w:spacing w:after="20"/>
               <w:rPr>
                 <w:rFonts w:ascii="Times New Roman" w:hAnsi="Times New Roman" w:cs="Times New Roman"/>
-              </w:rPr>
-            </w:pPr>
-            <w:r>
-              <w:rPr>
-                <w:rFonts w:ascii="Times New Roman" w:hAnsi="Times New Roman" w:cs="Times New Roman"/>
-                <w:sz w:val="14"/>
+                <w:sz w:val="18"/>
+                <w:szCs w:val="32"/>
+              </w:rPr>
+            </w:pPr>
+            <w:r>
+              <w:rPr>
+                <w:rFonts w:ascii="Times New Roman" w:hAnsi="Times New Roman" w:cs="Times New Roman"/>
+                <w:sz w:val="18"/>
+                <w:szCs w:val="32"/>
               </w:rPr>
               <w:t>Offline consistency</w:t>
             </w:r>
@@ -11148,12 +11188,15 @@
               <w:spacing w:after="20"/>
               <w:rPr>
                 <w:rFonts w:ascii="Times New Roman" w:hAnsi="Times New Roman" w:cs="Times New Roman"/>
-              </w:rPr>
-            </w:pPr>
-            <w:r>
-              <w:rPr>
-                <w:rFonts w:ascii="Times New Roman" w:hAnsi="Times New Roman" w:cs="Times New Roman"/>
-                <w:sz w:val="14"/>
+                <w:sz w:val="18"/>
+                <w:szCs w:val="32"/>
+              </w:rPr>
+            </w:pPr>
+            <w:r>
+              <w:rPr>
+                <w:rFonts w:ascii="Times New Roman" w:hAnsi="Times New Roman" w:cs="Times New Roman"/>
+                <w:sz w:val="18"/>
+                <w:szCs w:val="32"/>
               </w:rPr>
               <w:t>Local drafts and idempotent sync operations.</w:t>
             </w:r>
@@ -11168,12 +11211,15 @@
               <w:spacing w:after="20"/>
               <w:rPr>
                 <w:rFonts w:ascii="Times New Roman" w:hAnsi="Times New Roman" w:cs="Times New Roman"/>
-              </w:rPr>
-            </w:pPr>
-            <w:r>
-              <w:rPr>
-                <w:rFonts w:ascii="Times New Roman" w:hAnsi="Times New Roman" w:cs="Times New Roman"/>
-                <w:sz w:val="14"/>
+                <w:sz w:val="18"/>
+                <w:szCs w:val="32"/>
+              </w:rPr>
+            </w:pPr>
+            <w:r>
+              <w:rPr>
+                <w:rFonts w:ascii="Times New Roman" w:hAnsi="Times New Roman" w:cs="Times New Roman"/>
+                <w:sz w:val="18"/>
+                <w:szCs w:val="32"/>
               </w:rPr>
               <w:t>Airplane-mode and conflict scenarios.</w:t>
             </w:r>
@@ -11194,12 +11240,15 @@
               <w:spacing w:after="20"/>
               <w:rPr>
                 <w:rFonts w:ascii="Times New Roman" w:hAnsi="Times New Roman" w:cs="Times New Roman"/>
-              </w:rPr>
-            </w:pPr>
-            <w:r>
-              <w:rPr>
-                <w:rFonts w:ascii="Times New Roman" w:hAnsi="Times New Roman" w:cs="Times New Roman"/>
-                <w:sz w:val="14"/>
+                <w:sz w:val="18"/>
+                <w:szCs w:val="32"/>
+              </w:rPr>
+            </w:pPr>
+            <w:r>
+              <w:rPr>
+                <w:rFonts w:ascii="Times New Roman" w:hAnsi="Times New Roman" w:cs="Times New Roman"/>
+                <w:sz w:val="18"/>
+                <w:szCs w:val="32"/>
               </w:rPr>
               <w:t>Integration</w:t>
             </w:r>
@@ -11215,12 +11264,15 @@
               <w:spacing w:after="20"/>
               <w:rPr>
                 <w:rFonts w:ascii="Times New Roman" w:hAnsi="Times New Roman" w:cs="Times New Roman"/>
-              </w:rPr>
-            </w:pPr>
-            <w:r>
-              <w:rPr>
-                <w:rFonts w:ascii="Times New Roman" w:hAnsi="Times New Roman" w:cs="Times New Roman"/>
-                <w:sz w:val="14"/>
+                <w:sz w:val="18"/>
+                <w:szCs w:val="32"/>
+              </w:rPr>
+            </w:pPr>
+            <w:r>
+              <w:rPr>
+                <w:rFonts w:ascii="Times New Roman" w:hAnsi="Times New Roman" w:cs="Times New Roman"/>
+                <w:sz w:val="18"/>
+                <w:szCs w:val="32"/>
               </w:rPr>
               <w:t>Versioned HTTPS API and schema-validated events.</w:t>
             </w:r>
@@ -11236,12 +11288,15 @@
               <w:spacing w:after="20"/>
               <w:rPr>
                 <w:rFonts w:ascii="Times New Roman" w:hAnsi="Times New Roman" w:cs="Times New Roman"/>
-              </w:rPr>
-            </w:pPr>
-            <w:r>
-              <w:rPr>
-                <w:rFonts w:ascii="Times New Roman" w:hAnsi="Times New Roman" w:cs="Times New Roman"/>
-                <w:sz w:val="14"/>
+                <w:sz w:val="18"/>
+                <w:szCs w:val="32"/>
+              </w:rPr>
+            </w:pPr>
+            <w:r>
+              <w:rPr>
+                <w:rFonts w:ascii="Times New Roman" w:hAnsi="Times New Roman" w:cs="Times New Roman"/>
+                <w:sz w:val="18"/>
+                <w:szCs w:val="32"/>
               </w:rPr>
               <w:t>Contract tests; OAuth/token expiry scenarios.</w:t>
             </w:r>
@@ -11310,6 +11365,8 @@
             <w:pPr>
               <w:rPr>
                 <w:rFonts w:ascii="Times New Roman" w:hAnsi="Times New Roman" w:cs="Times New Roman"/>
+                <w:sz w:val="20"/>
+                <w:szCs w:val="36"/>
               </w:rPr>
             </w:pPr>
             <w:r>
@@ -11317,7 +11374,8 @@
                 <w:rFonts w:ascii="Times New Roman" w:hAnsi="Times New Roman" w:cs="Times New Roman"/>
                 <w:b/>
                 <w:color w:val="FFFFFF"/>
-                <w:sz w:val="15"/>
+                <w:sz w:val="20"/>
+                <w:szCs w:val="36"/>
               </w:rPr>
               <w:t>ADR field</w:t>
             </w:r>
@@ -11332,6 +11390,8 @@
             <w:pPr>
               <w:rPr>
                 <w:rFonts w:ascii="Times New Roman" w:hAnsi="Times New Roman" w:cs="Times New Roman"/>
+                <w:sz w:val="20"/>
+                <w:szCs w:val="36"/>
               </w:rPr>
             </w:pPr>
             <w:r>
@@ -11339,7 +11399,8 @@
                 <w:rFonts w:ascii="Times New Roman" w:hAnsi="Times New Roman" w:cs="Times New Roman"/>
                 <w:b/>
                 <w:color w:val="FFFFFF"/>
-                <w:sz w:val="15"/>
+                <w:sz w:val="20"/>
+                <w:szCs w:val="36"/>
               </w:rPr>
               <w:t>Record</w:t>
             </w:r>
@@ -11359,12 +11420,15 @@
               <w:spacing w:after="20"/>
               <w:rPr>
                 <w:rFonts w:ascii="Times New Roman" w:hAnsi="Times New Roman" w:cs="Times New Roman"/>
-              </w:rPr>
-            </w:pPr>
-            <w:r>
-              <w:rPr>
-                <w:rFonts w:ascii="Times New Roman" w:hAnsi="Times New Roman" w:cs="Times New Roman"/>
-                <w:sz w:val="15"/>
+                <w:sz w:val="18"/>
+                <w:szCs w:val="32"/>
+              </w:rPr>
+            </w:pPr>
+            <w:r>
+              <w:rPr>
+                <w:rFonts w:ascii="Times New Roman" w:hAnsi="Times New Roman" w:cs="Times New Roman"/>
+                <w:sz w:val="18"/>
+                <w:szCs w:val="32"/>
               </w:rPr>
               <w:t>Title</w:t>
             </w:r>
@@ -11379,13 +11443,16 @@
               <w:spacing w:after="20"/>
               <w:rPr>
                 <w:rFonts w:ascii="Times New Roman" w:hAnsi="Times New Roman" w:cs="Times New Roman"/>
+                <w:sz w:val="18"/>
+                <w:szCs w:val="32"/>
               </w:rPr>
             </w:pPr>
             <w:proofErr w:type="spellStart"/>
             <w:r>
               <w:rPr>
                 <w:rFonts w:ascii="Times New Roman" w:hAnsi="Times New Roman" w:cs="Times New Roman"/>
-                <w:sz w:val="15"/>
+                <w:sz w:val="18"/>
+                <w:szCs w:val="32"/>
               </w:rPr>
               <w:t>FitFlow</w:t>
             </w:r>
@@ -11393,7 +11460,8 @@
             <w:r>
               <w:rPr>
                 <w:rFonts w:ascii="Times New Roman" w:hAnsi="Times New Roman" w:cs="Times New Roman"/>
-                <w:sz w:val="15"/>
+                <w:sz w:val="18"/>
+                <w:szCs w:val="32"/>
               </w:rPr>
               <w:t xml:space="preserve"> mobile-first cross-platform stack with isolated AI and relational source of truth</w:t>
             </w:r>
@@ -11414,12 +11482,15 @@
               <w:spacing w:after="20"/>
               <w:rPr>
                 <w:rFonts w:ascii="Times New Roman" w:hAnsi="Times New Roman" w:cs="Times New Roman"/>
-              </w:rPr>
-            </w:pPr>
-            <w:r>
-              <w:rPr>
-                <w:rFonts w:ascii="Times New Roman" w:hAnsi="Times New Roman" w:cs="Times New Roman"/>
-                <w:sz w:val="15"/>
+                <w:sz w:val="18"/>
+                <w:szCs w:val="32"/>
+              </w:rPr>
+            </w:pPr>
+            <w:r>
+              <w:rPr>
+                <w:rFonts w:ascii="Times New Roman" w:hAnsi="Times New Roman" w:cs="Times New Roman"/>
+                <w:sz w:val="18"/>
+                <w:szCs w:val="32"/>
               </w:rPr>
               <w:t>Status / date</w:t>
             </w:r>
@@ -11435,13 +11506,16 @@
               <w:spacing w:after="20"/>
               <w:rPr>
                 <w:rFonts w:ascii="Times New Roman" w:hAnsi="Times New Roman" w:cs="Times New Roman"/>
+                <w:sz w:val="18"/>
+                <w:szCs w:val="32"/>
               </w:rPr>
             </w:pPr>
             <w:proofErr w:type="gramStart"/>
             <w:r>
               <w:rPr>
                 <w:rFonts w:ascii="Times New Roman" w:hAnsi="Times New Roman" w:cs="Times New Roman"/>
-                <w:sz w:val="15"/>
+                <w:sz w:val="18"/>
+                <w:szCs w:val="32"/>
               </w:rPr>
               <w:t>Proposed for</w:t>
             </w:r>
@@ -11449,7 +11523,8 @@
             <w:r>
               <w:rPr>
                 <w:rFonts w:ascii="Times New Roman" w:hAnsi="Times New Roman" w:cs="Times New Roman"/>
-                <w:sz w:val="15"/>
+                <w:sz w:val="18"/>
+                <w:szCs w:val="32"/>
               </w:rPr>
               <w:t xml:space="preserve"> coursework / 16 September 2026</w:t>
             </w:r>
@@ -11469,12 +11544,15 @@
               <w:spacing w:after="20"/>
               <w:rPr>
                 <w:rFonts w:ascii="Times New Roman" w:hAnsi="Times New Roman" w:cs="Times New Roman"/>
-              </w:rPr>
-            </w:pPr>
-            <w:r>
-              <w:rPr>
-                <w:rFonts w:ascii="Times New Roman" w:hAnsi="Times New Roman" w:cs="Times New Roman"/>
-                <w:sz w:val="15"/>
+                <w:sz w:val="18"/>
+                <w:szCs w:val="32"/>
+              </w:rPr>
+            </w:pPr>
+            <w:r>
+              <w:rPr>
+                <w:rFonts w:ascii="Times New Roman" w:hAnsi="Times New Roman" w:cs="Times New Roman"/>
+                <w:sz w:val="18"/>
+                <w:szCs w:val="32"/>
               </w:rPr>
               <w:t>Context</w:t>
             </w:r>
@@ -11489,12 +11567,15 @@
               <w:spacing w:after="20"/>
               <w:rPr>
                 <w:rFonts w:ascii="Times New Roman" w:hAnsi="Times New Roman" w:cs="Times New Roman"/>
-              </w:rPr>
-            </w:pPr>
-            <w:r>
-              <w:rPr>
-                <w:rFonts w:ascii="Times New Roman" w:hAnsi="Times New Roman" w:cs="Times New Roman"/>
-                <w:sz w:val="15"/>
+                <w:sz w:val="18"/>
+                <w:szCs w:val="32"/>
+              </w:rPr>
+            </w:pPr>
+            <w:r>
+              <w:rPr>
+                <w:rFonts w:ascii="Times New Roman" w:hAnsi="Times New Roman" w:cs="Times New Roman"/>
+                <w:sz w:val="18"/>
+                <w:szCs w:val="32"/>
               </w:rPr>
               <w:t>Declining retention, nutrition friction, personalization gap, private social needs and modest team size [S1].</w:t>
             </w:r>
@@ -11515,12 +11596,15 @@
               <w:spacing w:after="20"/>
               <w:rPr>
                 <w:rFonts w:ascii="Times New Roman" w:hAnsi="Times New Roman" w:cs="Times New Roman"/>
-              </w:rPr>
-            </w:pPr>
-            <w:r>
-              <w:rPr>
-                <w:rFonts w:ascii="Times New Roman" w:hAnsi="Times New Roman" w:cs="Times New Roman"/>
-                <w:sz w:val="15"/>
+                <w:sz w:val="18"/>
+                <w:szCs w:val="32"/>
+              </w:rPr>
+            </w:pPr>
+            <w:r>
+              <w:rPr>
+                <w:rFonts w:ascii="Times New Roman" w:hAnsi="Times New Roman" w:cs="Times New Roman"/>
+                <w:sz w:val="18"/>
+                <w:szCs w:val="32"/>
               </w:rPr>
               <w:t>Decision</w:t>
             </w:r>
@@ -11536,12 +11620,15 @@
               <w:spacing w:after="20"/>
               <w:rPr>
                 <w:rFonts w:ascii="Times New Roman" w:hAnsi="Times New Roman" w:cs="Times New Roman"/>
-              </w:rPr>
-            </w:pPr>
-            <w:r>
-              <w:rPr>
-                <w:rFonts w:ascii="Times New Roman" w:hAnsi="Times New Roman" w:cs="Times New Roman"/>
-                <w:sz w:val="15"/>
+                <w:sz w:val="18"/>
+                <w:szCs w:val="32"/>
+              </w:rPr>
+            </w:pPr>
+            <w:r>
+              <w:rPr>
+                <w:rFonts w:ascii="Times New Roman" w:hAnsi="Times New Roman" w:cs="Times New Roman"/>
+                <w:sz w:val="18"/>
+                <w:szCs w:val="32"/>
               </w:rPr>
               <w:t xml:space="preserve">React Native/Expo frontend; </w:t>
             </w:r>
@@ -11549,7 +11636,8 @@
             <w:r>
               <w:rPr>
                 <w:rFonts w:ascii="Times New Roman" w:hAnsi="Times New Roman" w:cs="Times New Roman"/>
-                <w:sz w:val="15"/>
+                <w:sz w:val="18"/>
+                <w:szCs w:val="32"/>
               </w:rPr>
               <w:t>NestJS</w:t>
             </w:r>
@@ -11557,7 +11645,8 @@
             <w:r>
               <w:rPr>
                 <w:rFonts w:ascii="Times New Roman" w:hAnsi="Times New Roman" w:cs="Times New Roman"/>
-                <w:sz w:val="15"/>
+                <w:sz w:val="18"/>
+                <w:szCs w:val="32"/>
               </w:rPr>
               <w:t xml:space="preserve"> core API; Python </w:t>
             </w:r>
@@ -11565,7 +11654,8 @@
             <w:r>
               <w:rPr>
                 <w:rFonts w:ascii="Times New Roman" w:hAnsi="Times New Roman" w:cs="Times New Roman"/>
-                <w:sz w:val="15"/>
+                <w:sz w:val="18"/>
+                <w:szCs w:val="32"/>
               </w:rPr>
               <w:t>FastAPI</w:t>
             </w:r>
@@ -11573,7 +11663,8 @@
             <w:r>
               <w:rPr>
                 <w:rFonts w:ascii="Times New Roman" w:hAnsi="Times New Roman" w:cs="Times New Roman"/>
-                <w:sz w:val="15"/>
+                <w:sz w:val="18"/>
+                <w:szCs w:val="32"/>
               </w:rPr>
               <w:t xml:space="preserve"> AI service; managed PostgreSQL; Cognito; </w:t>
             </w:r>
@@ -11581,7 +11672,8 @@
             <w:r>
               <w:rPr>
                 <w:rFonts w:ascii="Times New Roman" w:hAnsi="Times New Roman" w:cs="Times New Roman"/>
-                <w:sz w:val="15"/>
+                <w:sz w:val="18"/>
+                <w:szCs w:val="32"/>
               </w:rPr>
               <w:t>WebSockets</w:t>
             </w:r>
@@ -11589,7 +11681,8 @@
             <w:r>
               <w:rPr>
                 <w:rFonts w:ascii="Times New Roman" w:hAnsi="Times New Roman" w:cs="Times New Roman"/>
-                <w:sz w:val="15"/>
+                <w:sz w:val="18"/>
+                <w:szCs w:val="32"/>
               </w:rPr>
               <w:t>; optional Redis/on-device inference.</w:t>
             </w:r>
@@ -11609,12 +11702,15 @@
               <w:spacing w:after="20"/>
               <w:rPr>
                 <w:rFonts w:ascii="Times New Roman" w:hAnsi="Times New Roman" w:cs="Times New Roman"/>
-              </w:rPr>
-            </w:pPr>
-            <w:r>
-              <w:rPr>
-                <w:rFonts w:ascii="Times New Roman" w:hAnsi="Times New Roman" w:cs="Times New Roman"/>
-                <w:sz w:val="15"/>
+                <w:sz w:val="18"/>
+                <w:szCs w:val="32"/>
+              </w:rPr>
+            </w:pPr>
+            <w:r>
+              <w:rPr>
+                <w:rFonts w:ascii="Times New Roman" w:hAnsi="Times New Roman" w:cs="Times New Roman"/>
+                <w:sz w:val="18"/>
+                <w:szCs w:val="32"/>
               </w:rPr>
               <w:t>Alternatives</w:t>
             </w:r>
@@ -11629,12 +11725,15 @@
               <w:spacing w:after="20"/>
               <w:rPr>
                 <w:rFonts w:ascii="Times New Roman" w:hAnsi="Times New Roman" w:cs="Times New Roman"/>
-              </w:rPr>
-            </w:pPr>
-            <w:r>
-              <w:rPr>
-                <w:rFonts w:ascii="Times New Roman" w:hAnsi="Times New Roman" w:cs="Times New Roman"/>
-                <w:sz w:val="15"/>
+                <w:sz w:val="18"/>
+                <w:szCs w:val="32"/>
+              </w:rPr>
+            </w:pPr>
+            <w:r>
+              <w:rPr>
+                <w:rFonts w:ascii="Times New Roman" w:hAnsi="Times New Roman" w:cs="Times New Roman"/>
+                <w:sz w:val="18"/>
+                <w:szCs w:val="32"/>
               </w:rPr>
               <w:t xml:space="preserve">Flutter full stack; KMP shared logic; separate Swift/Kotlin; </w:t>
             </w:r>
@@ -11642,7 +11741,8 @@
             <w:r>
               <w:rPr>
                 <w:rFonts w:ascii="Times New Roman" w:hAnsi="Times New Roman" w:cs="Times New Roman"/>
-                <w:sz w:val="15"/>
+                <w:sz w:val="18"/>
+                <w:szCs w:val="32"/>
               </w:rPr>
               <w:t>Firestore</w:t>
             </w:r>
@@ -11650,7 +11750,8 @@
             <w:r>
               <w:rPr>
                 <w:rFonts w:ascii="Times New Roman" w:hAnsi="Times New Roman" w:cs="Times New Roman"/>
-                <w:sz w:val="15"/>
+                <w:sz w:val="18"/>
+                <w:szCs w:val="32"/>
               </w:rPr>
               <w:t>-first real-time app; MongoDB schema flexibility.</w:t>
             </w:r>
@@ -11671,12 +11772,15 @@
               <w:spacing w:after="20"/>
               <w:rPr>
                 <w:rFonts w:ascii="Times New Roman" w:hAnsi="Times New Roman" w:cs="Times New Roman"/>
-              </w:rPr>
-            </w:pPr>
-            <w:r>
-              <w:rPr>
-                <w:rFonts w:ascii="Times New Roman" w:hAnsi="Times New Roman" w:cs="Times New Roman"/>
-                <w:sz w:val="15"/>
+                <w:sz w:val="18"/>
+                <w:szCs w:val="32"/>
+              </w:rPr>
+            </w:pPr>
+            <w:r>
+              <w:rPr>
+                <w:rFonts w:ascii="Times New Roman" w:hAnsi="Times New Roman" w:cs="Times New Roman"/>
+                <w:sz w:val="18"/>
+                <w:szCs w:val="32"/>
               </w:rPr>
               <w:t>Reasons</w:t>
             </w:r>
@@ -11692,12 +11796,15 @@
               <w:spacing w:after="20"/>
               <w:rPr>
                 <w:rFonts w:ascii="Times New Roman" w:hAnsi="Times New Roman" w:cs="Times New Roman"/>
-              </w:rPr>
-            </w:pPr>
-            <w:r>
-              <w:rPr>
-                <w:rFonts w:ascii="Times New Roman" w:hAnsi="Times New Roman" w:cs="Times New Roman"/>
-                <w:sz w:val="15"/>
+                <w:sz w:val="18"/>
+                <w:szCs w:val="32"/>
+              </w:rPr>
+            </w:pPr>
+            <w:r>
+              <w:rPr>
+                <w:rFonts w:ascii="Times New Roman" w:hAnsi="Times New Roman" w:cs="Times New Roman"/>
+                <w:sz w:val="18"/>
+                <w:szCs w:val="32"/>
               </w:rPr>
               <w:t>Shared TS workflow, documented web path, modular real-time APIs, transactional records, isolated model workloads [R</w:t>
             </w:r>
@@ -11705,7 +11812,8 @@
             <w:r>
               <w:rPr>
                 <w:rFonts w:ascii="Times New Roman" w:hAnsi="Times New Roman" w:cs="Times New Roman"/>
-                <w:sz w:val="15"/>
+                <w:sz w:val="18"/>
+                <w:szCs w:val="32"/>
               </w:rPr>
               <w:t>1,R6,R7,R9,R</w:t>
             </w:r>
@@ -11713,7 +11821,8 @@
             <w:r>
               <w:rPr>
                 <w:rFonts w:ascii="Times New Roman" w:hAnsi="Times New Roman" w:cs="Times New Roman"/>
-                <w:sz w:val="15"/>
+                <w:sz w:val="18"/>
+                <w:szCs w:val="32"/>
               </w:rPr>
               <w:t>12].</w:t>
             </w:r>
@@ -11733,12 +11842,15 @@
               <w:spacing w:after="20"/>
               <w:rPr>
                 <w:rFonts w:ascii="Times New Roman" w:hAnsi="Times New Roman" w:cs="Times New Roman"/>
-              </w:rPr>
-            </w:pPr>
-            <w:r>
-              <w:rPr>
-                <w:rFonts w:ascii="Times New Roman" w:hAnsi="Times New Roman" w:cs="Times New Roman"/>
-                <w:sz w:val="15"/>
+                <w:sz w:val="18"/>
+                <w:szCs w:val="32"/>
+              </w:rPr>
+            </w:pPr>
+            <w:r>
+              <w:rPr>
+                <w:rFonts w:ascii="Times New Roman" w:hAnsi="Times New Roman" w:cs="Times New Roman"/>
+                <w:sz w:val="18"/>
+                <w:szCs w:val="32"/>
               </w:rPr>
               <w:t>Consequences</w:t>
             </w:r>
@@ -11753,12 +11865,15 @@
               <w:spacing w:after="20"/>
               <w:rPr>
                 <w:rFonts w:ascii="Times New Roman" w:hAnsi="Times New Roman" w:cs="Times New Roman"/>
-              </w:rPr>
-            </w:pPr>
-            <w:r>
-              <w:rPr>
-                <w:rFonts w:ascii="Times New Roman" w:hAnsi="Times New Roman" w:cs="Times New Roman"/>
-                <w:sz w:val="15"/>
+                <w:sz w:val="18"/>
+                <w:szCs w:val="32"/>
+              </w:rPr>
+            </w:pPr>
+            <w:r>
+              <w:rPr>
+                <w:rFonts w:ascii="Times New Roman" w:hAnsi="Times New Roman" w:cs="Times New Roman"/>
+                <w:sz w:val="18"/>
+                <w:szCs w:val="32"/>
               </w:rPr>
               <w:t>Extra AI service and WebSocket deployment; separate identity integration; operational overhead vs all-Firebase approach.</w:t>
             </w:r>
@@ -11779,12 +11894,15 @@
               <w:spacing w:after="20"/>
               <w:rPr>
                 <w:rFonts w:ascii="Times New Roman" w:hAnsi="Times New Roman" w:cs="Times New Roman"/>
-              </w:rPr>
-            </w:pPr>
-            <w:r>
-              <w:rPr>
-                <w:rFonts w:ascii="Times New Roman" w:hAnsi="Times New Roman" w:cs="Times New Roman"/>
-                <w:sz w:val="15"/>
+                <w:sz w:val="18"/>
+                <w:szCs w:val="32"/>
+              </w:rPr>
+            </w:pPr>
+            <w:r>
+              <w:rPr>
+                <w:rFonts w:ascii="Times New Roman" w:hAnsi="Times New Roman" w:cs="Times New Roman"/>
+                <w:sz w:val="18"/>
+                <w:szCs w:val="32"/>
               </w:rPr>
               <w:t>Risk controls</w:t>
             </w:r>
@@ -11800,12 +11918,15 @@
               <w:spacing w:after="20"/>
               <w:rPr>
                 <w:rFonts w:ascii="Times New Roman" w:hAnsi="Times New Roman" w:cs="Times New Roman"/>
-              </w:rPr>
-            </w:pPr>
-            <w:r>
-              <w:rPr>
-                <w:rFonts w:ascii="Times New Roman" w:hAnsi="Times New Roman" w:cs="Times New Roman"/>
-                <w:sz w:val="15"/>
+                <w:sz w:val="18"/>
+                <w:szCs w:val="32"/>
+              </w:rPr>
+            </w:pPr>
+            <w:r>
+              <w:rPr>
+                <w:rFonts w:ascii="Times New Roman" w:hAnsi="Times New Roman" w:cs="Times New Roman"/>
+                <w:sz w:val="18"/>
+                <w:szCs w:val="32"/>
               </w:rPr>
               <w:t xml:space="preserve">Spike web/camera integration, verify BAA eligibility, test per-group </w:t>
             </w:r>
@@ -11813,7 +11934,8 @@
             <w:r>
               <w:rPr>
                 <w:rFonts w:ascii="Times New Roman" w:hAnsi="Times New Roman" w:cs="Times New Roman"/>
-                <w:sz w:val="15"/>
+                <w:sz w:val="18"/>
+                <w:szCs w:val="32"/>
               </w:rPr>
               <w:t>authz</w:t>
             </w:r>
@@ -11821,7 +11943,8 @@
             <w:r>
               <w:rPr>
                 <w:rFonts w:ascii="Times New Roman" w:hAnsi="Times New Roman" w:cs="Times New Roman"/>
-                <w:sz w:val="15"/>
+                <w:sz w:val="18"/>
+                <w:szCs w:val="32"/>
               </w:rPr>
               <w:t>, budget ML, security review and model evaluation.</w:t>
             </w:r>
@@ -11841,12 +11964,15 @@
               <w:spacing w:after="20"/>
               <w:rPr>
                 <w:rFonts w:ascii="Times New Roman" w:hAnsi="Times New Roman" w:cs="Times New Roman"/>
-              </w:rPr>
-            </w:pPr>
-            <w:r>
-              <w:rPr>
-                <w:rFonts w:ascii="Times New Roman" w:hAnsi="Times New Roman" w:cs="Times New Roman"/>
-                <w:sz w:val="15"/>
+                <w:sz w:val="18"/>
+                <w:szCs w:val="32"/>
+              </w:rPr>
+            </w:pPr>
+            <w:r>
+              <w:rPr>
+                <w:rFonts w:ascii="Times New Roman" w:hAnsi="Times New Roman" w:cs="Times New Roman"/>
+                <w:sz w:val="18"/>
+                <w:szCs w:val="32"/>
               </w:rPr>
               <w:t>Revisit trigger</w:t>
             </w:r>
@@ -11861,12 +11987,15 @@
               <w:spacing w:after="20"/>
               <w:rPr>
                 <w:rFonts w:ascii="Times New Roman" w:hAnsi="Times New Roman" w:cs="Times New Roman"/>
-              </w:rPr>
-            </w:pPr>
-            <w:r>
-              <w:rPr>
-                <w:rFonts w:ascii="Times New Roman" w:hAnsi="Times New Roman" w:cs="Times New Roman"/>
-                <w:sz w:val="15"/>
+                <w:sz w:val="18"/>
+                <w:szCs w:val="32"/>
+              </w:rPr>
+            </w:pPr>
+            <w:r>
+              <w:rPr>
+                <w:rFonts w:ascii="Times New Roman" w:hAnsi="Times New Roman" w:cs="Times New Roman"/>
+                <w:sz w:val="18"/>
+                <w:szCs w:val="32"/>
               </w:rPr>
               <w:t>Poor web accessibility, ML bridge incompatibility, unsustainable ops cost, changed PHI obligations or failed load tests.</w:t>
             </w:r>
@@ -11882,6 +12011,47 @@
         </w:rPr>
       </w:pPr>
       <w:bookmarkStart w:id="23" w:name="_Toc240566524"/>
+    </w:p>
+    <w:p/>
+    <w:p>
+      <w:r>
+        <w:rPr>
+          <w:rFonts w:ascii="Times New Roman" w:hAnsi="Times New Roman" w:cs="Times New Roman"/>
+        </w:rPr>
+        <w:lastRenderedPageBreak/>
+        <w:t xml:space="preserve">Git Hub </w:t>
+      </w:r>
+      <w:proofErr w:type="gramStart"/>
+      <w:r>
+        <w:rPr>
+          <w:rFonts w:ascii="Times New Roman" w:hAnsi="Times New Roman" w:cs="Times New Roman"/>
+        </w:rPr>
+        <w:t>Link</w:t>
+      </w:r>
+      <w:r>
+        <w:t xml:space="preserve"> :</w:t>
+      </w:r>
+      <w:proofErr w:type="gramEnd"/>
+      <w:r>
+        <w:t xml:space="preserve"> </w:t>
+      </w:r>
+      <w:hyperlink r:id="rId11" w:history="1">
+        <w:r>
+          <w:rPr>
+            <w:rStyle w:val="Hyperlink"/>
+            <w:rFonts w:ascii="Times New Roman" w:hAnsi="Times New Roman" w:cs="Times New Roman"/>
+          </w:rPr>
+          <w:t>https://github.com/Chandulajeewantha2003/fitflow-redesign.git</w:t>
+        </w:r>
+      </w:hyperlink>
+    </w:p>
+    <w:p>
+      <w:pPr>
+        <w:pStyle w:val="Heading1"/>
+        <w:rPr>
+          <w:rFonts w:ascii="Times New Roman" w:hAnsi="Times New Roman" w:cs="Times New Roman"/>
+        </w:rPr>
+      </w:pPr>
       <w:r>
         <w:rPr>
           <w:rFonts w:ascii="Times New Roman" w:hAnsi="Times New Roman" w:cs="Times New Roman"/>
@@ -11981,7 +12151,6 @@
         <w:rPr>
           <w:rFonts w:ascii="Times New Roman" w:hAnsi="Times New Roman" w:cs="Times New Roman"/>
         </w:rPr>
-        <w:lastRenderedPageBreak/>
         <w:t>[S3] IT3060 Lab Exercise 01 research (student-provided PDF). Five coded participants P1-P5; student-provided report.</w:t>
       </w:r>
     </w:p>
@@ -12234,6 +12403,7 @@
         <w:rPr>
           <w:rFonts w:ascii="Times New Roman" w:hAnsi="Times New Roman" w:cs="Times New Roman"/>
         </w:rPr>
+        <w:lastRenderedPageBreak/>
         <w:t xml:space="preserve">[R13] </w:t>
       </w:r>
       <w:proofErr w:type="spellStart"/>
@@ -12341,7 +12511,6 @@
         <w:rPr>
           <w:rFonts w:ascii="Times New Roman" w:hAnsi="Times New Roman" w:cs="Times New Roman"/>
         </w:rPr>
-        <w:lastRenderedPageBreak/>
         <w:t>[R18] Google Cloud: HIPAA compliance and BAA scope. https://cloud.google.com/security/compliance/hipaa-compliance</w:t>
       </w:r>
     </w:p>
@@ -14732,6 +14901,7 @@
   <w:style w:type="paragraph" w:default="1" w:styleId="Normal">
     <w:name w:val="Normal"/>
     <w:qFormat/>
+    <w:rsid w:val="00711E0A"/>
   </w:style>
   <w:style w:type="paragraph" w:styleId="Heading1">
     <w:name w:val="heading 1"/>

</xml_diff>